<commit_message>
feat(register): Formfassung v2 — Fließtext, Fundort·Sigle als Kopfzeile, Verbregel
Neue Fassung des Register-Bands (wer_dies_liest_register_v2.docx, 134 Stücke):
- Fließtext: jeder Eintrag als ein fortlaufender Block ohne Verszeilen.
- Fundort · Sigle als Kopfzeile ÜBER jedem Eintrag (statt darunter).
- Verbregel: finite Er-Form nur, wo das Original ein Verb vorsieht; sonst
  nominal (kein Infinitiv). Textbestand aus v1 unverändert; „X war hier“-
  Litanei in II bleibt erhalten.
- Nachwort auf die vom Autor überarbeitete Fassung umgestellt; Beizeilen-
  Erklärung an die Kopfzeile-Platzierung angepasst.
- Doku (REGISTER_BAND_AUSWAHL.md) und standalone nachwort.docx nachgezogen.

Co-Authored-By: Claude Opus 4.8 <noreply@anthropic.com>
Claude-Session: https://claude.ai/code/session_01WJ6p9HdvKuJ9ea1tbSE1cy
</commit_message>
<xml_diff>
--- a/safaitic-research/Poetics/register/nachwort.docx
+++ b/safaitic-research/Poetics/register/nachwort.docx
@@ -23,7 +23,7 @@
           <w:sz w:val="22"/>
           <w:szCs w:val="22"/>
         </w:rPr>
-        <w:t xml:space="preserve">Wer diese Texte liest, merkt bald: die meisten sind keine Gedichte. Viele sind kürzer als ein Satz, manche nur ein Name. Das ist kein Mangel, sondern die Form. Safaitisch schreiben heißt, an einen Stein zu klopfen, an dem man gerade vorbeikommt — für niemanden Bestimmten, weil der Stein bleibt, wenn man weitergeht.</w:t>
+        <w:t xml:space="preserve">Die meisten sind keine Gedichte. Viele kürzer als ein Satz, manche nur Name. Die Formen - safaitisch - schreiben heißt, an einen Stein zu klopfen, an dem man gerade vorbeikommt — er bleibt, wenn man weitergeht.</w:t>
       </w:r>
     </w:p>
     <w:p>
@@ -36,7 +36,7 @@
           <w:sz w:val="22"/>
           <w:szCs w:val="22"/>
         </w:rPr>
-        <w:t xml:space="preserve">Was so entsteht, ist kein Literatur-System, sondern ein Verständigen anderer Art: eines, das nicht auf die Gleichzeitigkeit von Sender und Empfänger angewiesen ist, das die Gottheit als Zeugen einschließt und das Schweigen als eigene Aussage kennt.</w:t>
+        <w:t xml:space="preserve">Das Verständigen anderer Art, die antiken Beduinen nicht auf die Gleichzeitigkeit von Sender und Empfänger angewiesen. Es schließt Wüste, Hitze und Kälte, Steine als Zeugen ein und kennt Schweigen als eigene Aussage kennt. Im Gegensatz zu modernen Feeds operieren die Inschriften über minimale Zeichenzahl existenzieller Tiefe über lange Dauer.</w:t>
       </w:r>
     </w:p>
     <w:p>
@@ -49,7 +49,7 @@
           <w:sz w:val="22"/>
           <w:szCs w:val="22"/>
         </w:rPr>
-        <w:t xml:space="preserve">Dieser Band ordnet darum nicht nach Thema, sondern nach Sprechhaltung. Jedes der acht Register ist eine andere Art, mit dem Stein zu sprechen — vom Stehen in der Ahnenreihe und dem bloßen Dasein über das Warten, die Bitte und die Klage bis zum Fluch, zum Zeugnis und zuletzt zum Verstummen. Jedes Register eröffnen einige lange Inschriften aus der erweiterten Ausgabe; danach folgen die knappen Stimmen des Vollkorpus.</w:t>
+        <w:t xml:space="preserve">Jedes der acht Register dieses Bandes eine andere Art, mit dem Stein zu sprechen — vom Stehen in der Ahnenreihe, dem bloßen Dasein über das Warten, Bitten und Klagen bis zum Fluch, bis Zeugnis und zuletzt Verstummen. Die Register eröffnen einige lange Inschriften, es folgen knappere Stimmen.</w:t>
       </w:r>
     </w:p>
     <w:p>
@@ -62,7 +62,7 @@
           <w:sz w:val="22"/>
           <w:szCs w:val="22"/>
         </w:rPr>
-        <w:t xml:space="preserve">Die Texte stehen in der dritten Person, wie ihre Originale (l-Fulān, „Von X“, danach „und er …“). Genealogien sind getilgt — außer in „stehe“ (I), wo die Ahnenreihe selbst der Akt ist, und in „schweige“ (VIII), wo das Fehlen spricht. Lücken werden hier nicht geglättet; die Striche ---- bleiben stehen.</w:t>
+        <w:t xml:space="preserve">Texte stehen in der dritten Person, wie ihre Originale (l-Fulān, „Von X“, danach „und er …“). Genealogien sind getilgt — außer in „stehe“ (I), wo die Ahnenreihe selbst der Akt ist, und in „schweige“ (VIII), wo das Fehlen spricht. Lücken werden hier nicht geglättet; die Striche ---- bleiben stehen. Die unregelmäßige Oberfläche des Steins und Erosion oder Beschädigung des Steins bilden eine untrennbare Einheit.</w:t>
       </w:r>
     </w:p>
     <w:p>
@@ -75,7 +75,7 @@
           <w:sz w:val="22"/>
           <w:szCs w:val="22"/>
         </w:rPr>
-        <w:t xml:space="preserve">Der Band schöpft aus dem Vollkorpus der ~31.800 safaitischen Inschriften (OCIANA), nicht aus einer Spitzenauswahl. Erschlossen sind damit auch die rund 18.500 reinen Signaturen und die Minimal-Texte, die in den bisherigen Bänden fehlten — sie tragen die Register „stehe“ (die Ahnenreihen) und „schreibe“ (die Litanei „X war hier“).</w:t>
+        <w:t xml:space="preserve">Der Band schöpft aus dem Vollkorpus der ~31.800 safaitischen Inschriften (OCIANA), die zwischen dem ersten und vierten Jahrhundert n. Chr. in Süden Syriens und in Nordjordanien entstanden sind. Erschlossen sind damit auch rund 18.500 reinen Signaturen und die Minimal-Texte — sie tragen die Register „stehe“ (die Ahnenreihen) und „schreibe“ (die Litanei „X war hier“). Revier- und Präsenzmarkierung, indifferent gegenüber dem konkreten Empfänger. Sie steht im Raum, unabhängig davon, ob und wann sie gelesen wird.</w:t>
       </w:r>
     </w:p>
     <w:p>
@@ -88,7 +88,7 @@
           <w:sz w:val="22"/>
           <w:szCs w:val="22"/>
         </w:rPr>
-        <w:t xml:space="preserve">Jedes Register ist gezielt aus seinem eigenen Korpus-Material gespeist: die Signaturen für „schreibe“ und „stehe“, die Anrufungen für „bitte“, die Fluchformeln für „verfluche“, die fragmentarischen Steine für „schweige“, die datierten für „bezeuge“. Den Auftakt geben je Register Kopfstücke aus der erweiterten Ausgabe (lange Inschriften zuerst). Die Auswahl ist kuratiert und nicht repräsentativ; jede Nachdichtung trägt die OCIANA-Sigle ihrer Quelle.</w:t>
+        <w:t xml:space="preserve">Jedes Register speist aus seinem eigenen Korpus-Material: die Signaturen für „schreibe“ und „stehe“, die Anrufungen für „bitte“, die Fluchformeln für „verfluche“, die fragmentarischen Steine für „schweige“, die datierten für „bezeuge“. Die Auswahl ist kuratiert, nicht repräsentativ; jede Nachdichtung trägt die Sigle ihrer Quelle im Korpus.</w:t>
       </w:r>
     </w:p>
     <w:p>
@@ -101,7 +101,7 @@
           <w:sz w:val="22"/>
           <w:szCs w:val="22"/>
         </w:rPr>
-        <w:t xml:space="preserve">Übersetzungskette: gemeißelter Stein → philologische Lesung → englische OCIANA-Edition → deutsche Nachdichtung. Eckige Klammern und Striche ---- der Philologen bleiben im Register „schweige“ sichtbar.</w:t>
+        <w:t xml:space="preserve">Übersetzungskette: gemeißelter Stein → philologische Lesung → englische OCIANA-Edition → deutsche Nachdichtung. Eckige Klammern und Striche ---- der Philologen bleiben im Register „schweige“ sichtbar. Protokolle eines kaum sterblichen sprachlichen Systems.</w:t>
       </w:r>
     </w:p>
     <w:p>
@@ -128,7 +128,7 @@
           <w:sz w:val="22"/>
           <w:szCs w:val="22"/>
         </w:rPr>
-        <w:t xml:space="preserve">Die acht Titel sind jeweils der Infinitiv des Verbs ohne das End-„n“ (schreiben → schreibe, stehen → stehe, …). Diese verkürzte Form ist absichtlich mehrdeutig: Sie ist zugleich erste Person Singular Präsens („ich schreibe“ — die aneignende Stimme), dritte Person Konjunktiv Präsens („er schreibe“ — der Wunsch, der die dritte Person und die Bitten und Flüche der Originale trifft), Imperativ („schreibe!“ — der Befehl an den späteren Leser oder die Gottheit) und mitunter Nomen (die Klage, die Bitte). Weil das Wort auf keine dieser Lesarten festgelegt ist, wird es — im Wortspiel mit „Infinitiv“ — infinit: unbegrenzt, in mehrere Richtungen zugleich offen. Das entspricht dem Gegenstand des Bandes: der aufgeschobenen Inschrift ohne festen Sender und Empfänger, die Aussage, Wunsch und Befehl in einem ist.</w:t>
+        <w:t xml:space="preserve">Die acht Titel sind jeweils der Infinitiv des Verbs ohne das End-„n“ (schreiben → schreibe, stehen → stehe, …). Diese verkürzte Form ist absichtlich mehrdeutig: Sie ist zugleich erste Person Singular Präsens („ich schreibe“ — die aneignende Stimme), dritte Person Konjunktiv Präsens („er schreibe“ — der Wunsch, der die dritte Person und die Bitten und Flüche der Originale trifft), Imperativ („schreibe!“ — der Befehl an den späteren Leser oder die Gottheit) und mitunter Nomen (die Klage, die Bitte). Weil das Wort auf keine dieser Lesarten festgelegt ist, wird es — im Wortspiel mit „Infinitiv“ — infinit: unbegrenzt, in mehrere Richtungen zugleich offen. Das entspricht dem Gegenstand des Bandes: der aufgeschobenen Inschrift ohne festen Sender und Empfänger, die Aussage, Wunsch und Befehl in einem ist. Im Safaitischen (einer nordarabischen Konsonantenschrift) sind Vokale und damit exakte grammatische Modi oft hochgradig mehrdeutig oder aus dem Kontext zu erschließen. Die Reduktion auf die wurzelhafte Stammform im Deutschen bildet diese semantische Offenheit präzise ab.</w:t>
       </w:r>
     </w:p>
     <w:p>
@@ -155,7 +155,7 @@
           <w:sz w:val="22"/>
           <w:szCs w:val="22"/>
         </w:rPr>
-        <w:t xml:space="preserve">Jede Nachdichtung nennt am Fuß zuerst den Fundort, dann die Corpus-Sigle. Die Siglen bezeichnen die Sammlung oder Edition, in der die Inschrift zuerst erfasst wurde:</w:t>
+        <w:t xml:space="preserve">Jede Nachdichtung trägt als Kopfzeile zuerst den Fundort, dann die Corpus-Sigle. Die Siglen bezeichnen die Sammlung oder Edition, in der die Inschrift zuerst erfasst wurde:</w:t>
       </w:r>
     </w:p>
     <w:tbl>

</xml_diff>

<commit_message>
feat(register): Nachwort — Siglen & Fundorte vollständig, deckungsgleich mit Text
Die Nachwort-Listen erfassen jetzt genau das im Band Vorkommende: alle 34
Sigle-Präfixe (HCH, KRS, LP, WH detailliert; übrige nach Editions-/Survey-
Familie gruppiert und je benannt) und alle 37 Fundorte. Kein Eintrag ohne
Beleg im Text, kein Vorkommen ohne Erklärung — per Skript in beide Richtungen
geprüft (0 fehlend, 0 überzählig).

Co-Authored-By: Claude Opus 4.8 <noreply@anthropic.com>
Claude-Session: https://claude.ai/code/session_0143Htt48KuahcxHdkkeComr
</commit_message>
<xml_diff>
--- a/safaitic-research/Poetics/register/nachwort.docx
+++ b/safaitic-research/Poetics/register/nachwort.docx
@@ -155,6 +155,248 @@
         <w:t xml:space="preserve">: Winnett &amp; Harding, Inscriptions from Fifty Safaitic Cairns – Die umfassende Dokumentation von fünfzig Steinhügeln, die als strukturelles Rückgrat der modernen safaitischen Epigraphik gilt.</w:t>
       </w:r>
     </w:p>
+    <w:p>
+      <w:pPr>
+        <w:spacing w:after="120" w:line="300"/>
+      </w:pPr>
+      <w:r>
+        <w:rPr>
+          <w:rFonts w:ascii="Georgia" w:cs="Georgia" w:eastAsia="Georgia" w:hAnsi="Georgia"/>
+          <w:b/>
+          <w:sz w:val="22"/>
+          <w:szCs w:val="22"/>
+        </w:rPr>
+        <w:t xml:space="preserve">C</w:t>
+      </w:r>
+      <w:r>
+        <w:rPr>
+          <w:rFonts w:ascii="Georgia" w:cs="Georgia" w:eastAsia="Georgia" w:hAnsi="Georgia"/>
+          <w:sz w:val="22"/>
+          <w:szCs w:val="22"/>
+        </w:rPr>
+        <w:t xml:space="preserve">: Corpus Inscriptionum Semiticarum, Pars V – die safaitischen Inschriften (u. a. Dussaud &amp; Macler; Ryckmans 1950).</w:t>
+      </w:r>
+    </w:p>
+    <w:p>
+      <w:pPr>
+        <w:spacing w:after="120" w:line="300"/>
+      </w:pPr>
+      <w:r>
+        <w:rPr>
+          <w:rFonts w:ascii="Georgia" w:cs="Georgia" w:eastAsia="Georgia" w:hAnsi="Georgia"/>
+          <w:b/>
+          <w:sz w:val="22"/>
+          <w:szCs w:val="22"/>
+        </w:rPr>
+        <w:t xml:space="preserve">SIJ</w:t>
+      </w:r>
+      <w:r>
+        <w:rPr>
+          <w:rFonts w:ascii="Georgia" w:cs="Georgia" w:eastAsia="Georgia" w:hAnsi="Georgia"/>
+          <w:sz w:val="22"/>
+          <w:szCs w:val="22"/>
+        </w:rPr>
+        <w:t xml:space="preserve">: Winnett, Safaitic Inscriptions from Jordan (Toronto 1957).</w:t>
+      </w:r>
+    </w:p>
+    <w:p>
+      <w:pPr>
+        <w:spacing w:after="120" w:line="300"/>
+      </w:pPr>
+      <w:r>
+        <w:rPr>
+          <w:rFonts w:ascii="Georgia" w:cs="Georgia" w:eastAsia="Georgia" w:hAnsi="Georgia"/>
+          <w:b/>
+          <w:sz w:val="22"/>
+          <w:szCs w:val="22"/>
+        </w:rPr>
+        <w:t xml:space="preserve">ISB</w:t>
+      </w:r>
+      <w:r>
+        <w:rPr>
+          <w:rFonts w:ascii="Georgia" w:cs="Georgia" w:eastAsia="Georgia" w:hAnsi="Georgia"/>
+          <w:sz w:val="22"/>
+          <w:szCs w:val="22"/>
+        </w:rPr>
+        <w:t xml:space="preserve">: Oxtoby, Some Inscriptions of the Safaitic Bedouin (New Haven 1968).</w:t>
+      </w:r>
+    </w:p>
+    <w:p>
+      <w:pPr>
+        <w:spacing w:after="120" w:line="300"/>
+      </w:pPr>
+      <w:r>
+        <w:rPr>
+          <w:rFonts w:ascii="Georgia" w:cs="Georgia" w:eastAsia="Georgia" w:hAnsi="Georgia"/>
+          <w:b/>
+          <w:sz w:val="22"/>
+          <w:szCs w:val="22"/>
+        </w:rPr>
+        <w:t xml:space="preserve">CSNS</w:t>
+      </w:r>
+      <w:r>
+        <w:rPr>
+          <w:rFonts w:ascii="Georgia" w:cs="Georgia" w:eastAsia="Georgia" w:hAnsi="Georgia"/>
+          <w:sz w:val="22"/>
+          <w:szCs w:val="22"/>
+        </w:rPr>
+        <w:t xml:space="preserve">: Clark, A Study of New Safaitic Inscriptions from Jordan (1979).</w:t>
+      </w:r>
+    </w:p>
+    <w:p>
+      <w:pPr>
+        <w:spacing w:after="120" w:line="300"/>
+      </w:pPr>
+      <w:r>
+        <w:rPr>
+          <w:rFonts w:ascii="Georgia" w:cs="Georgia" w:eastAsia="Georgia" w:hAnsi="Georgia"/>
+          <w:b/>
+          <w:sz w:val="22"/>
+          <w:szCs w:val="22"/>
+        </w:rPr>
+        <w:t xml:space="preserve">Rees</w:t>
+      </w:r>
+      <w:r>
+        <w:rPr>
+          <w:rFonts w:ascii="Georgia" w:cs="Georgia" w:eastAsia="Georgia" w:hAnsi="Georgia"/>
+          <w:sz w:val="22"/>
+          <w:szCs w:val="22"/>
+        </w:rPr>
+        <w:t xml:space="preserve">: L. W. B. Rees, frühe Aufnahmen aus der Ḥarrat al-Raǧil (1920er Jahre).</w:t>
+      </w:r>
+    </w:p>
+    <w:p>
+      <w:pPr>
+        <w:spacing w:after="120" w:line="300"/>
+      </w:pPr>
+      <w:r>
+        <w:rPr>
+          <w:rFonts w:ascii="Georgia" w:cs="Georgia" w:eastAsia="Georgia" w:hAnsi="Georgia"/>
+          <w:b/>
+          <w:sz w:val="22"/>
+          <w:szCs w:val="22"/>
+        </w:rPr>
+        <w:t xml:space="preserve">Is.L / Is.Mu</w:t>
+      </w:r>
+      <w:r>
+        <w:rPr>
+          <w:rFonts w:ascii="Georgia" w:cs="Georgia" w:eastAsia="Georgia" w:hAnsi="Georgia"/>
+          <w:sz w:val="22"/>
+          <w:szCs w:val="22"/>
+        </w:rPr>
+        <w:t xml:space="preserve">: Sammlungen aus al-ʿĪsāwī (Rif Dimašq); Editionsnachweis jeweils im OCIANA-Eintrag.</w:t>
+      </w:r>
+    </w:p>
+    <w:p>
+      <w:pPr>
+        <w:spacing w:after="120" w:line="300"/>
+      </w:pPr>
+      <w:r>
+        <w:rPr>
+          <w:rFonts w:ascii="Georgia" w:cs="Georgia" w:eastAsia="Georgia" w:hAnsi="Georgia"/>
+          <w:b/>
+          <w:sz w:val="22"/>
+          <w:szCs w:val="22"/>
+        </w:rPr>
+        <w:t xml:space="preserve">RQ.A / RQ.D</w:t>
+      </w:r>
+      <w:r>
+        <w:rPr>
+          <w:rFonts w:ascii="Georgia" w:cs="Georgia" w:eastAsia="Georgia" w:hAnsi="Georgia"/>
+          <w:sz w:val="22"/>
+          <w:szCs w:val="22"/>
+        </w:rPr>
+        <w:t xml:space="preserve">: Aufnahmen aus Riǧm Qaʿqūl (Rif Dimašq).</w:t>
+      </w:r>
+    </w:p>
+    <w:p>
+      <w:pPr>
+        <w:spacing w:after="120" w:line="300"/>
+      </w:pPr>
+      <w:r>
+        <w:rPr>
+          <w:rFonts w:ascii="Georgia" w:cs="Georgia" w:eastAsia="Georgia" w:hAnsi="Georgia"/>
+          <w:b/>
+          <w:sz w:val="22"/>
+          <w:szCs w:val="22"/>
+        </w:rPr>
+        <w:t xml:space="preserve">RSIS / ASWS / SSWS / AbSWS / RWQ</w:t>
+      </w:r>
+      <w:r>
+        <w:rPr>
+          <w:rFonts w:ascii="Georgia" w:cs="Georgia" w:eastAsia="Georgia" w:hAnsi="Georgia"/>
+          <w:sz w:val="22"/>
+          <w:szCs w:val="22"/>
+        </w:rPr>
+        <w:t xml:space="preserve">: Surveys der Wādī-Sārah- und Wādī-Salma-Region (Provinz Al-Mafraq).</w:t>
+      </w:r>
+    </w:p>
+    <w:p>
+      <w:pPr>
+        <w:spacing w:after="120" w:line="300"/>
+      </w:pPr>
+      <w:r>
+        <w:rPr>
+          <w:rFonts w:ascii="Georgia" w:cs="Georgia" w:eastAsia="Georgia" w:hAnsi="Georgia"/>
+          <w:b/>
+          <w:sz w:val="22"/>
+          <w:szCs w:val="22"/>
+        </w:rPr>
+        <w:t xml:space="preserve">AbaNS / HaNS / HaNSB / HNSD / HSNS</w:t>
+      </w:r>
+      <w:r>
+        <w:rPr>
+          <w:rFonts w:ascii="Georgia" w:cs="Georgia" w:eastAsia="Georgia" w:hAnsi="Georgia"/>
+          <w:sz w:val="22"/>
+          <w:szCs w:val="22"/>
+        </w:rPr>
+        <w:t xml:space="preserve">: nordjordanische Safaitic-Surveys.</w:t>
+      </w:r>
+    </w:p>
+    <w:p>
+      <w:pPr>
+        <w:spacing w:after="120" w:line="300"/>
+      </w:pPr>
+      <w:r>
+        <w:rPr>
+          <w:rFonts w:ascii="Georgia" w:cs="Georgia" w:eastAsia="Georgia" w:hAnsi="Georgia"/>
+          <w:b/>
+          <w:sz w:val="22"/>
+          <w:szCs w:val="22"/>
+        </w:rPr>
+        <w:t xml:space="preserve">AAEK / ASFF</w:t>
+      </w:r>
+      <w:r>
+        <w:rPr>
+          <w:rFonts w:ascii="Georgia" w:cs="Georgia" w:eastAsia="Georgia" w:hAnsi="Georgia"/>
+          <w:sz w:val="22"/>
+          <w:szCs w:val="22"/>
+        </w:rPr>
+        <w:t xml:space="preserve">: Surveys von Qāʿ Fahadah (Provinz Al-Mafraq).</w:t>
+      </w:r>
+    </w:p>
+    <w:p>
+      <w:pPr>
+        <w:spacing w:after="120" w:line="300"/>
+      </w:pPr>
+      <w:r>
+        <w:rPr>
+          <w:rFonts w:ascii="Georgia" w:cs="Georgia" w:eastAsia="Georgia" w:hAnsi="Georgia"/>
+          <w:b/>
+          <w:sz w:val="22"/>
+          <w:szCs w:val="22"/>
+        </w:rPr>
+        <w:t xml:space="preserve">JaS / KWQ / CEDS / GSSH / MKJS / BS / WAMS / BWM / ZN</w:t>
+      </w:r>
+      <w:r>
+        <w:rPr>
+          <w:rFonts w:ascii="Georgia" w:cs="Georgia" w:eastAsia="Georgia" w:hAnsi="Georgia"/>
+          <w:sz w:val="22"/>
+          <w:szCs w:val="22"/>
+        </w:rPr>
+        <w:t xml:space="preserve">: weitere OCIANA-Survey-Siglen aus der nordostjordanischen Ḥarrah; vollständiger Editionsnachweis jeweils im OCIANA-Eintrag.</w:t>
+      </w:r>
+    </w:p>
     <w:p/>
     <w:p>
       <w:pPr>
@@ -282,15 +524,37 @@
           <w:sz w:val="22"/>
           <w:szCs w:val="22"/>
         </w:rPr>
-        <w:t xml:space="preserve">Jathum / Jawa / Wādī Miqāṭ / Qāʿ al-Maḥfūr / Qāʿ Fahadah / Zimlet Nāṣir</w:t>
-      </w:r>
-      <w:r>
-        <w:rPr>
-          <w:rFonts w:ascii="Georgia" w:cs="Georgia" w:eastAsia="Georgia" w:hAnsi="Georgia"/>
-          <w:sz w:val="22"/>
-          <w:szCs w:val="22"/>
-        </w:rPr>
-        <w:t xml:space="preserve">: Fundpunkte und archäologische Surveys innerhalb der nordostjordanischen Basaltwüste (Regionen Safawi und Ruwayshid).</w:t>
+        <w:t xml:space="preserve">Qāʿ Fahadah</w:t>
+      </w:r>
+      <w:r>
+        <w:rPr>
+          <w:rFonts w:ascii="Georgia" w:cs="Georgia" w:eastAsia="Georgia" w:hAnsi="Georgia"/>
+          <w:sz w:val="22"/>
+          <w:szCs w:val="22"/>
+        </w:rPr>
+        <w:t xml:space="preserve">: Fundplatz in der Provinz Al-Mafraq, Nordostjordanien (Ahnenreihen in Kapitel I).</w:t>
+      </w:r>
+    </w:p>
+    <w:p>
+      <w:pPr>
+        <w:spacing w:after="120" w:line="300"/>
+      </w:pPr>
+      <w:r>
+        <w:rPr>
+          <w:rFonts w:ascii="Georgia" w:cs="Georgia" w:eastAsia="Georgia" w:hAnsi="Georgia"/>
+          <w:b/>
+          <w:sz w:val="22"/>
+          <w:szCs w:val="22"/>
+        </w:rPr>
+        <w:t xml:space="preserve">Jathum / Jawa / Wādī Miqāṭ / Qāʿ al-Maḥfūr / Zimlet Nāṣir / bei Safawi / bei Ruwayshid</w:t>
+      </w:r>
+      <w:r>
+        <w:rPr>
+          <w:rFonts w:ascii="Georgia" w:cs="Georgia" w:eastAsia="Georgia" w:hAnsi="Georgia"/>
+          <w:sz w:val="22"/>
+          <w:szCs w:val="22"/>
+        </w:rPr>
+        <w:t xml:space="preserve">: weitere Fundpunkte und Surveys innerhalb der nordostjordanischen Basaltwüste.</w:t>
       </w:r>
     </w:p>
     <w:p>
@@ -335,6 +599,182 @@
           <w:szCs w:val="22"/>
         </w:rPr>
         <w:t xml:space="preserve">: Fundplätze im Gouvernement Rif Dimašq, innerhalb der südsyrischen Basaltlandschaft.</w:t>
+      </w:r>
+    </w:p>
+    <w:p>
+      <w:pPr>
+        <w:spacing w:after="120" w:line="300"/>
+      </w:pPr>
+      <w:r>
+        <w:rPr>
+          <w:rFonts w:ascii="Georgia" w:cs="Georgia" w:eastAsia="Georgia" w:hAnsi="Georgia"/>
+          <w:b/>
+          <w:sz w:val="22"/>
+          <w:szCs w:val="22"/>
+        </w:rPr>
+        <w:t xml:space="preserve">Ǧabal Says</w:t>
+      </w:r>
+      <w:r>
+        <w:rPr>
+          <w:rFonts w:ascii="Georgia" w:cs="Georgia" w:eastAsia="Georgia" w:hAnsi="Georgia"/>
+          <w:sz w:val="22"/>
+          <w:szCs w:val="22"/>
+        </w:rPr>
+        <w:t xml:space="preserve">: Basaltmassiv im Gouvernement Rif Dimašq, südsyrische Ṣafā.</w:t>
+      </w:r>
+    </w:p>
+    <w:p>
+      <w:pPr>
+        <w:spacing w:after="120" w:line="300"/>
+      </w:pPr>
+      <w:r>
+        <w:rPr>
+          <w:rFonts w:ascii="Georgia" w:cs="Georgia" w:eastAsia="Georgia" w:hAnsi="Georgia"/>
+          <w:b/>
+          <w:sz w:val="22"/>
+          <w:szCs w:val="22"/>
+        </w:rPr>
+        <w:t xml:space="preserve">Tall aḍ-Ḍabiʿ</w:t>
+      </w:r>
+      <w:r>
+        <w:rPr>
+          <w:rFonts w:ascii="Georgia" w:cs="Georgia" w:eastAsia="Georgia" w:hAnsi="Georgia"/>
+          <w:sz w:val="22"/>
+          <w:szCs w:val="22"/>
+        </w:rPr>
+        <w:t xml:space="preserve">: Tall aḍ-Ḍabiʿ am Wādī as-Samin, Süd-Syrien.</w:t>
+      </w:r>
+    </w:p>
+    <w:p>
+      <w:pPr>
+        <w:spacing w:after="120" w:line="300"/>
+      </w:pPr>
+      <w:r>
+        <w:rPr>
+          <w:rFonts w:ascii="Georgia" w:cs="Georgia" w:eastAsia="Georgia" w:hAnsi="Georgia"/>
+          <w:b/>
+          <w:sz w:val="22"/>
+          <w:szCs w:val="22"/>
+        </w:rPr>
+        <w:t xml:space="preserve">Al-Mrōshan / Khirbat al-Hubayrīyah / Khirbat al-Umbāšī</w:t>
+      </w:r>
+      <w:r>
+        <w:rPr>
+          <w:rFonts w:ascii="Georgia" w:cs="Georgia" w:eastAsia="Georgia" w:hAnsi="Georgia"/>
+          <w:sz w:val="22"/>
+          <w:szCs w:val="22"/>
+        </w:rPr>
+        <w:t xml:space="preserve">: Fundpunkte im Gouvernement Al-Suwaydā, Süd-Syrien.</w:t>
+      </w:r>
+    </w:p>
+    <w:p>
+      <w:pPr>
+        <w:spacing w:after="120" w:line="300"/>
+      </w:pPr>
+      <w:r>
+        <w:rPr>
+          <w:rFonts w:ascii="Georgia" w:cs="Georgia" w:eastAsia="Georgia" w:hAnsi="Georgia"/>
+          <w:b/>
+          <w:sz w:val="22"/>
+          <w:szCs w:val="22"/>
+        </w:rPr>
+        <w:t xml:space="preserve">Al-Mafraq</w:t>
+      </w:r>
+      <w:r>
+        <w:rPr>
+          <w:rFonts w:ascii="Georgia" w:cs="Georgia" w:eastAsia="Georgia" w:hAnsi="Georgia"/>
+          <w:sz w:val="22"/>
+          <w:szCs w:val="22"/>
+        </w:rPr>
+        <w:t xml:space="preserve">: Provinz Al-Mafraq (Nordostjordanien) – genauer Fundpunkt nicht angegeben.</w:t>
+      </w:r>
+    </w:p>
+    <w:p>
+      <w:pPr>
+        <w:spacing w:after="120" w:line="300"/>
+      </w:pPr>
+      <w:r>
+        <w:rPr>
+          <w:rFonts w:ascii="Georgia" w:cs="Georgia" w:eastAsia="Georgia" w:hAnsi="Georgia"/>
+          <w:b/>
+          <w:sz w:val="22"/>
+          <w:szCs w:val="22"/>
+        </w:rPr>
+        <w:t xml:space="preserve">Rif Dimašq / Al-Suwaydā</w:t>
+      </w:r>
+      <w:r>
+        <w:rPr>
+          <w:rFonts w:ascii="Georgia" w:cs="Georgia" w:eastAsia="Georgia" w:hAnsi="Georgia"/>
+          <w:sz w:val="22"/>
+          <w:szCs w:val="22"/>
+        </w:rPr>
+        <w:t xml:space="preserve">: südsyrische Gouvernements (Ṣafā) – genauer Fundpunkt nicht angegeben.</w:t>
+      </w:r>
+    </w:p>
+    <w:p>
+      <w:pPr>
+        <w:spacing w:after="120" w:line="300"/>
+      </w:pPr>
+      <w:r>
+        <w:rPr>
+          <w:rFonts w:ascii="Georgia" w:cs="Georgia" w:eastAsia="Georgia" w:hAnsi="Georgia"/>
+          <w:b/>
+          <w:sz w:val="22"/>
+          <w:szCs w:val="22"/>
+        </w:rPr>
+        <w:t xml:space="preserve">Jordanien (allg.) / Syrien (allg.)</w:t>
+      </w:r>
+      <w:r>
+        <w:rPr>
+          <w:rFonts w:ascii="Georgia" w:cs="Georgia" w:eastAsia="Georgia" w:hAnsi="Georgia"/>
+          <w:sz w:val="22"/>
+          <w:szCs w:val="22"/>
+        </w:rPr>
+        <w:t xml:space="preserve">: nur das Land überliefert (Ḥarrah bzw. Ṣafā).</w:t>
+      </w:r>
+    </w:p>
+    <w:p>
+      <w:pPr>
+        <w:spacing w:after="120" w:line="300"/>
+      </w:pPr>
+      <w:r>
+        <w:rPr>
+          <w:rFonts w:ascii="Georgia" w:cs="Georgia" w:eastAsia="Georgia" w:hAnsi="Georgia"/>
+          <w:b/>
+          <w:sz w:val="22"/>
+          <w:szCs w:val="22"/>
+        </w:rPr>
+        <w:t xml:space="preserve">Site 4 / Site 12 / Site 13 · Tell 5 · Tell al-ʿAbd · Cairn 9 / Cairn 10 · WH Cairn 7 · EDS 80-5 · Km 910</w:t>
+      </w:r>
+      <w:r>
+        <w:rPr>
+          <w:rFonts w:ascii="Georgia" w:cs="Georgia" w:eastAsia="Georgia" w:hAnsi="Georgia"/>
+          <w:sz w:val="22"/>
+          <w:szCs w:val="22"/>
+        </w:rPr>
+        <w:t xml:space="preserve">: interne Survey-Codes und Fundpunkte ohne näher benannten Ort (Nordostjordanien).</w:t>
+      </w:r>
+    </w:p>
+    <w:p>
+      <w:pPr>
+        <w:spacing w:after="120" w:line="300"/>
+      </w:pPr>
+      <w:r>
+        <w:rPr>
+          <w:rFonts w:ascii="Georgia" w:cs="Georgia" w:eastAsia="Georgia" w:hAnsi="Georgia"/>
+          <w:b/>
+          <w:sz w:val="22"/>
+          <w:szCs w:val="22"/>
+        </w:rPr>
+        <w:t xml:space="preserve">Fundort unbekannt</w:t>
+      </w:r>
+      <w:r>
+        <w:rPr>
+          <w:rFonts w:ascii="Georgia" w:cs="Georgia" w:eastAsia="Georgia" w:hAnsi="Georgia"/>
+          <w:sz w:val="22"/>
+          <w:szCs w:val="22"/>
+        </w:rPr>
+        <w:t xml:space="preserve">: keine Ortsangabe im OCIANA-Eintrag.</w:t>
       </w:r>
     </w:p>
     <w:p/>

</xml_diff>